<commit_message>
Rev D: correct board order, BOM and review dispositions
</commit_message>
<xml_diff>
--- a/releases/evt-pre-20/2026-09-30-rev-d/Заказ_жгутов_и_кабелей/Заказ_антенн_и_RF_кабелей.docx
+++ b/releases/evt-pre-20/2026-09-30-rev-d/Заказ_жгутов_и_кабелей/Заказ_антенн_и_RF_кабелей.docx
@@ -5,91 +5,221 @@
     <w:p>
       <w:pPr>
         <w:pStyle w:val="a3"/>
-        <w:jc w:val="left"/>
+        <w:keepNext/>
+        <w:spacing w:line="240" w:lineRule="auto" w:before="0" w:after="0"/>
+        <w:ind w:firstLine="0"/>
+        <w:jc w:val="both"/>
       </w:pPr>
       <w:r>
+        <w:rPr>
+          <w:rFonts w:ascii="Times New Roman" w:hAnsi="Times New Roman" w:eastAsia="Times New Roman" w:cs="Times New Roman"/>
+          <w:b/>
+          <w:sz w:val="28"/>
+        </w:rPr>
         <w:t>Заказ антенн и RF-кабелей EVT-PRE-20</w:t>
       </w:r>
     </w:p>
     <w:p>
-      <w:pPr/>
+      <w:pPr>
+        <w:spacing w:line="240" w:lineRule="auto" w:before="0" w:after="0"/>
+        <w:ind w:firstLine="709"/>
+        <w:jc w:val="both"/>
+      </w:pPr>
       <w:r>
+        <w:rPr>
+          <w:rFonts w:ascii="Times New Roman" w:hAnsi="Times New Roman" w:eastAsia="Times New Roman" w:cs="Times New Roman"/>
+          <w:sz w:val="28"/>
+        </w:rPr>
         <w:t>Дионея · EVT-PRE-20 · 30 сентября 2026 года · Rev D</w:t>
       </w:r>
     </w:p>
     <w:p>
+      <w:pPr>
+        <w:spacing w:line="240" w:lineRule="auto" w:before="0" w:after="0"/>
+        <w:ind w:firstLine="709"/>
+        <w:jc w:val="both"/>
+      </w:pPr>
       <w:r>
+        <w:rPr>
+          <w:rFonts w:ascii="Times New Roman" w:hAnsi="Times New Roman" w:eastAsia="Times New Roman" w:cs="Times New Roman"/>
+          <w:sz w:val="28"/>
+        </w:rPr>
         <w:t>Заказ охватывает 22 аппаратных комплекта: 20 станций и два комплекта резерва. Использовать точные MPN без замены.</w:t>
       </w:r>
     </w:p>
     <w:p>
       <w:pPr>
         <w:pStyle w:val="2"/>
+        <w:keepNext/>
+        <w:spacing w:line="240" w:lineRule="auto" w:before="0" w:after="0"/>
+        <w:ind w:firstLine="0"/>
+        <w:jc w:val="both"/>
       </w:pPr>
       <w:r>
+        <w:rPr>
+          <w:rFonts w:ascii="Times New Roman" w:hAnsi="Times New Roman" w:eastAsia="Times New Roman" w:cs="Times New Roman"/>
+          <w:b/>
+          <w:sz w:val="28"/>
+        </w:rPr>
         <w:t>Состав заказа</w:t>
       </w:r>
     </w:p>
     <w:p>
+      <w:pPr>
+        <w:spacing w:line="240" w:lineRule="auto" w:before="0" w:after="0"/>
+        <w:ind w:firstLine="709"/>
+        <w:jc w:val="both"/>
+      </w:pPr>
       <w:r>
+        <w:rPr>
+          <w:rFonts w:ascii="Times New Roman" w:hAnsi="Times New Roman" w:eastAsia="Times New Roman" w:cs="Times New Roman"/>
+          <w:sz w:val="28"/>
+        </w:rPr>
         <w:t>66 пигтейлов Taoglas CAB.0243: по три на комплект, длина 150 мм, кабель 1,13 мм, MHF I/U.FL-совместимый угловой разъём на стороне платы и герметичный SMA(F) bulkhead нормальной полярности.</w:t>
       </w:r>
     </w:p>
     <w:p>
+      <w:pPr>
+        <w:spacing w:line="240" w:lineRule="auto" w:before="0" w:after="0"/>
+        <w:ind w:firstLine="709"/>
+        <w:jc w:val="both"/>
+      </w:pPr>
       <w:r>
+        <w:rPr>
+          <w:rFonts w:ascii="Times New Roman" w:hAnsi="Times New Roman" w:eastAsia="Times New Roman" w:cs="Times New Roman"/>
+          <w:sz w:val="28"/>
+        </w:rPr>
         <w:t>22 антенны LTE Taoglas G30.B.108111 для тракта J8; 22 активные GNSS антенны Taoglas AA.166.A.301111 для J9; 22 антенны RU868 Taoglas TI.89.B.2111W для J10.</w:t>
       </w:r>
     </w:p>
     <w:p>
       <w:pPr>
         <w:pStyle w:val="2"/>
+        <w:keepNext/>
+        <w:spacing w:line="240" w:lineRule="auto" w:before="0" w:after="0"/>
+        <w:ind w:firstLine="0"/>
+        <w:jc w:val="both"/>
       </w:pPr>
       <w:r>
+        <w:rPr>
+          <w:rFonts w:ascii="Times New Roman" w:hAnsi="Times New Roman" w:eastAsia="Times New Roman" w:cs="Times New Roman"/>
+          <w:b/>
+          <w:sz w:val="28"/>
+        </w:rPr>
         <w:t>Соединения</w:t>
       </w:r>
     </w:p>
     <w:p>
+      <w:pPr>
+        <w:spacing w:line="240" w:lineRule="auto" w:before="0" w:after="0"/>
+        <w:ind w:firstLine="709"/>
+        <w:jc w:val="both"/>
+      </w:pPr>
       <w:r>
+        <w:rPr>
+          <w:rFonts w:ascii="Times New Roman" w:hAnsi="Times New Roman" w:eastAsia="Times New Roman" w:cs="Times New Roman"/>
+          <w:sz w:val="28"/>
+        </w:rPr>
         <w:t>J8 PCB-MAIN → CAB.0243 → SMA bulkhead → G30.B.108111. J9 PCB-MAIN → CAB.0243 → SMA bulkhead → AA.166.A.301111. J10 PCB-MAIN → CAB.0243 → SMA bulkhead → TI.89.B.2111W.</w:t>
       </w:r>
     </w:p>
     <w:p>
+      <w:pPr>
+        <w:spacing w:line="240" w:lineRule="auto" w:before="0" w:after="0"/>
+        <w:ind w:firstLine="709"/>
+        <w:jc w:val="both"/>
+      </w:pPr>
       <w:r>
+        <w:rPr>
+          <w:rFonts w:ascii="Times New Roman" w:hAnsi="Times New Roman" w:eastAsia="Times New Roman" w:cs="Times New Roman"/>
+          <w:sz w:val="28"/>
+        </w:rPr>
         <w:t>Не менять местами J8/J9/J10. Радиус изгиба CAB.0243 не менее 6,8 мм. Зафиксировать маркировку CELL, GNSS и RU868 на обоих концах; кабель не прокладывать через силовые узлы и острые кромки.</w:t>
       </w:r>
     </w:p>
     <w:p>
       <w:pPr>
         <w:pStyle w:val="2"/>
+        <w:keepNext/>
+        <w:spacing w:line="240" w:lineRule="auto" w:before="0" w:after="0"/>
+        <w:ind w:firstLine="0"/>
+        <w:jc w:val="both"/>
       </w:pPr>
       <w:r>
+        <w:rPr>
+          <w:rFonts w:ascii="Times New Roman" w:hAnsi="Times New Roman" w:eastAsia="Times New Roman" w:cs="Times New Roman"/>
+          <w:b/>
+          <w:sz w:val="28"/>
+        </w:rPr>
         <w:t>Входной контроль и EOL</w:t>
       </w:r>
     </w:p>
     <w:p>
+      <w:pPr>
+        <w:spacing w:line="240" w:lineRule="auto" w:before="0" w:after="0"/>
+        <w:ind w:firstLine="709"/>
+        <w:jc w:val="both"/>
+      </w:pPr>
       <w:r>
+        <w:rPr>
+          <w:rFonts w:ascii="Times New Roman" w:hAnsi="Times New Roman" w:eastAsia="Times New Roman" w:cs="Times New Roman"/>
+          <w:sz w:val="28"/>
+        </w:rPr>
         <w:t>Для каждого CAB.0243 проверить длину, целостность, нормальную SMA-полярность, фиксацию MHF/U.FL, отсутствие повреждений и проводимость экрана/центрального контакта без короткого замыкания. После монтажа проверить затяжку bulkhead, уплотнение, радиус изгиба и разгрузку натяжения.</w:t>
       </w:r>
     </w:p>
     <w:p>
+      <w:pPr>
+        <w:spacing w:line="240" w:lineRule="auto" w:before="0" w:after="0"/>
+        <w:ind w:firstLine="709"/>
+        <w:jc w:val="both"/>
+      </w:pPr>
       <w:r>
+        <w:rPr>
+          <w:rFonts w:ascii="Times New Roman" w:hAnsi="Times New Roman" w:eastAsia="Times New Roman" w:cs="Times New Roman"/>
+          <w:sz w:val="28"/>
+        </w:rPr>
         <w:t>LTE: установленный VSWR/потери, attach и coexistence. GNSS: ток активной антенны при 3,3 В не более 50 мА, чувствительность и PPS. RU868: VSWR, мощность, чувствительность, coexistence и соответствие профилю RU868. Результаты привязать к серийному номеру станции.</w:t>
       </w:r>
     </w:p>
     <w:p>
       <w:pPr>
         <w:pStyle w:val="2"/>
+        <w:keepNext/>
+        <w:spacing w:line="240" w:lineRule="auto" w:before="0" w:after="0"/>
+        <w:ind w:firstLine="0"/>
+        <w:jc w:val="both"/>
       </w:pPr>
       <w:r>
+        <w:rPr>
+          <w:rFonts w:ascii="Times New Roman" w:hAnsi="Times New Roman" w:eastAsia="Times New Roman" w:cs="Times New Roman"/>
+          <w:b/>
+          <w:sz w:val="28"/>
+        </w:rPr>
         <w:t>Документы поставки</w:t>
       </w:r>
     </w:p>
     <w:p>
+      <w:pPr>
+        <w:spacing w:line="240" w:lineRule="auto" w:before="0" w:after="0"/>
+        <w:ind w:firstLine="709"/>
+        <w:jc w:val="both"/>
+      </w:pPr>
       <w:r>
+        <w:rPr>
+          <w:rFonts w:ascii="Times New Roman" w:hAnsi="Times New Roman" w:eastAsia="Times New Roman" w:cs="Times New Roman"/>
+          <w:sz w:val="28"/>
+        </w:rPr>
         <w:t>Счёт и упаковочный лист должны содержать точные MPN, количество и партию. Для G30.B.108111 зафиксировать фактически заказанную конструкцию кабеля, поскольку в опубликованных материалах производителя встречались разные описания. Любая замена требует ECO.</w:t>
       </w:r>
     </w:p>
     <w:sectPr>
+      <w:headerReference w:type="default" r:id="rId7"/>
+      <w:footerReference w:type="default" r:id="rId8"/>
+      <w:headerReference w:type="first" r:id="rId9"/>
+      <w:footerReference w:type="first" r:id="rId10"/>
+      <w:headerReference w:type="even" r:id="rId11"/>
+      <w:footerReference w:type="even" r:id="rId12"/>
       <w:pgSz w:w="11906" w:h="16838"/>
       <w:pgMar w:top="1134" w:right="850" w:bottom="1134" w:left="1701" w:header="708" w:footer="708" w:gutter="0"/>
       <w:cols w:space="720"/>
@@ -97,6 +227,84 @@
     </w:sectPr>
   </w:body>
 </w:document>
+</file>
+
+<file path=word/footer1.xml><?xml version="1.0" encoding="utf-8"?>
+<w:ftr xmlns:m="http://schemas.openxmlformats.org/officeDocument/2006/math" xmlns:mc="http://schemas.openxmlformats.org/markup-compatibility/2006" xmlns:mo="http://schemas.microsoft.com/office/mac/office/2008/main" xmlns:mv="urn:schemas-microsoft-com:mac:vml" xmlns:o="urn:schemas-microsoft-com:office:office" xmlns:r="http://schemas.openxmlformats.org/officeDocument/2006/relationships" xmlns:v="urn:schemas-microsoft-com:vml" xmlns:w10="urn:schemas-microsoft-com:office:word" xmlns:w14="http://schemas.microsoft.com/office/word/2010/wordml" xmlns:w="http://schemas.openxmlformats.org/wordprocessingml/2006/main" xmlns:wne="http://schemas.microsoft.com/office/word/2006/wordml" xmlns:wp14="http://schemas.microsoft.com/office/word/2010/wordprocessingDrawing" xmlns:wp="http://schemas.openxmlformats.org/drawingml/2006/wordprocessingDrawing" xmlns:wpc="http://schemas.microsoft.com/office/word/2010/wordprocessingCanvas" xmlns:wpg="http://schemas.microsoft.com/office/word/2010/wordprocessingGroup" xmlns:wpi="http://schemas.microsoft.com/office/word/2010/wordprocessingInk" xmlns:wps="http://schemas.microsoft.com/office/word/2010/wordprocessingShape" mc:Ignorable="w14 wp14">
+  <w:p>
+    <w:pPr>
+      <w:pStyle w:val="Footer"/>
+      <w:spacing w:line="240" w:lineRule="auto" w:before="0" w:after="0"/>
+      <w:ind w:firstLine="709"/>
+      <w:jc w:val="both"/>
+    </w:pPr>
+  </w:p>
+</w:ftr>
+</file>
+
+<file path=word/footer2.xml><?xml version="1.0" encoding="utf-8"?>
+<w:ftr xmlns:m="http://schemas.openxmlformats.org/officeDocument/2006/math" xmlns:mc="http://schemas.openxmlformats.org/markup-compatibility/2006" xmlns:mo="http://schemas.microsoft.com/office/mac/office/2008/main" xmlns:mv="urn:schemas-microsoft-com:mac:vml" xmlns:o="urn:schemas-microsoft-com:office:office" xmlns:r="http://schemas.openxmlformats.org/officeDocument/2006/relationships" xmlns:v="urn:schemas-microsoft-com:vml" xmlns:w10="urn:schemas-microsoft-com:office:word" xmlns:w14="http://schemas.microsoft.com/office/word/2010/wordml" xmlns:w="http://schemas.openxmlformats.org/wordprocessingml/2006/main" xmlns:wne="http://schemas.microsoft.com/office/word/2006/wordml" xmlns:wp14="http://schemas.microsoft.com/office/word/2010/wordprocessingDrawing" xmlns:wp="http://schemas.openxmlformats.org/drawingml/2006/wordprocessingDrawing" xmlns:wpc="http://schemas.microsoft.com/office/word/2010/wordprocessingCanvas" xmlns:wpg="http://schemas.microsoft.com/office/word/2010/wordprocessingGroup" xmlns:wpi="http://schemas.microsoft.com/office/word/2010/wordprocessingInk" xmlns:wps="http://schemas.microsoft.com/office/word/2010/wordprocessingShape" mc:Ignorable="w14 wp14">
+  <w:p>
+    <w:pPr>
+      <w:pStyle w:val="Footer"/>
+      <w:spacing w:line="240" w:lineRule="auto" w:before="0" w:after="0"/>
+      <w:ind w:firstLine="709"/>
+      <w:jc w:val="both"/>
+    </w:pPr>
+  </w:p>
+</w:ftr>
+</file>
+
+<file path=word/footer3.xml><?xml version="1.0" encoding="utf-8"?>
+<w:ftr xmlns:m="http://schemas.openxmlformats.org/officeDocument/2006/math" xmlns:mc="http://schemas.openxmlformats.org/markup-compatibility/2006" xmlns:mo="http://schemas.microsoft.com/office/mac/office/2008/main" xmlns:mv="urn:schemas-microsoft-com:mac:vml" xmlns:o="urn:schemas-microsoft-com:office:office" xmlns:r="http://schemas.openxmlformats.org/officeDocument/2006/relationships" xmlns:v="urn:schemas-microsoft-com:vml" xmlns:w10="urn:schemas-microsoft-com:office:word" xmlns:w14="http://schemas.microsoft.com/office/word/2010/wordml" xmlns:w="http://schemas.openxmlformats.org/wordprocessingml/2006/main" xmlns:wne="http://schemas.microsoft.com/office/word/2006/wordml" xmlns:wp14="http://schemas.microsoft.com/office/word/2010/wordprocessingDrawing" xmlns:wp="http://schemas.openxmlformats.org/drawingml/2006/wordprocessingDrawing" xmlns:wpc="http://schemas.microsoft.com/office/word/2010/wordprocessingCanvas" xmlns:wpg="http://schemas.microsoft.com/office/word/2010/wordprocessingGroup" xmlns:wpi="http://schemas.microsoft.com/office/word/2010/wordprocessingInk" xmlns:wps="http://schemas.microsoft.com/office/word/2010/wordprocessingShape" mc:Ignorable="w14 wp14">
+  <w:p>
+    <w:pPr>
+      <w:pStyle w:val="Footer"/>
+      <w:spacing w:line="240" w:lineRule="auto" w:before="0" w:after="0"/>
+      <w:ind w:firstLine="709"/>
+      <w:jc w:val="both"/>
+    </w:pPr>
+  </w:p>
+</w:ftr>
+</file>
+
+<file path=word/header1.xml><?xml version="1.0" encoding="utf-8"?>
+<w:hdr xmlns:m="http://schemas.openxmlformats.org/officeDocument/2006/math" xmlns:mc="http://schemas.openxmlformats.org/markup-compatibility/2006" xmlns:mo="http://schemas.microsoft.com/office/mac/office/2008/main" xmlns:mv="urn:schemas-microsoft-com:mac:vml" xmlns:o="urn:schemas-microsoft-com:office:office" xmlns:r="http://schemas.openxmlformats.org/officeDocument/2006/relationships" xmlns:v="urn:schemas-microsoft-com:vml" xmlns:w10="urn:schemas-microsoft-com:office:word" xmlns:w14="http://schemas.microsoft.com/office/word/2010/wordml" xmlns:w="http://schemas.openxmlformats.org/wordprocessingml/2006/main" xmlns:wne="http://schemas.microsoft.com/office/word/2006/wordml" xmlns:wp14="http://schemas.microsoft.com/office/word/2010/wordprocessingDrawing" xmlns:wp="http://schemas.openxmlformats.org/drawingml/2006/wordprocessingDrawing" xmlns:wpc="http://schemas.microsoft.com/office/word/2010/wordprocessingCanvas" xmlns:wpg="http://schemas.microsoft.com/office/word/2010/wordprocessingGroup" xmlns:wpi="http://schemas.microsoft.com/office/word/2010/wordprocessingInk" xmlns:wps="http://schemas.microsoft.com/office/word/2010/wordprocessingShape" mc:Ignorable="w14 wp14">
+  <w:p>
+    <w:pPr>
+      <w:pStyle w:val="Header"/>
+      <w:spacing w:line="240" w:lineRule="auto" w:before="0" w:after="0"/>
+      <w:ind w:firstLine="709"/>
+      <w:jc w:val="both"/>
+    </w:pPr>
+  </w:p>
+</w:hdr>
+</file>
+
+<file path=word/header2.xml><?xml version="1.0" encoding="utf-8"?>
+<w:hdr xmlns:m="http://schemas.openxmlformats.org/officeDocument/2006/math" xmlns:mc="http://schemas.openxmlformats.org/markup-compatibility/2006" xmlns:mo="http://schemas.microsoft.com/office/mac/office/2008/main" xmlns:mv="urn:schemas-microsoft-com:mac:vml" xmlns:o="urn:schemas-microsoft-com:office:office" xmlns:r="http://schemas.openxmlformats.org/officeDocument/2006/relationships" xmlns:v="urn:schemas-microsoft-com:vml" xmlns:w10="urn:schemas-microsoft-com:office:word" xmlns:w14="http://schemas.microsoft.com/office/word/2010/wordml" xmlns:w="http://schemas.openxmlformats.org/wordprocessingml/2006/main" xmlns:wne="http://schemas.microsoft.com/office/word/2006/wordml" xmlns:wp14="http://schemas.microsoft.com/office/word/2010/wordprocessingDrawing" xmlns:wp="http://schemas.openxmlformats.org/drawingml/2006/wordprocessingDrawing" xmlns:wpc="http://schemas.microsoft.com/office/word/2010/wordprocessingCanvas" xmlns:wpg="http://schemas.microsoft.com/office/word/2010/wordprocessingGroup" xmlns:wpi="http://schemas.microsoft.com/office/word/2010/wordprocessingInk" xmlns:wps="http://schemas.microsoft.com/office/word/2010/wordprocessingShape" mc:Ignorable="w14 wp14">
+  <w:p>
+    <w:pPr>
+      <w:pStyle w:val="Header"/>
+      <w:spacing w:line="240" w:lineRule="auto" w:before="0" w:after="0"/>
+      <w:ind w:firstLine="709"/>
+      <w:jc w:val="both"/>
+    </w:pPr>
+  </w:p>
+</w:hdr>
+</file>
+
+<file path=word/header3.xml><?xml version="1.0" encoding="utf-8"?>
+<w:hdr xmlns:m="http://schemas.openxmlformats.org/officeDocument/2006/math" xmlns:mc="http://schemas.openxmlformats.org/markup-compatibility/2006" xmlns:mo="http://schemas.microsoft.com/office/mac/office/2008/main" xmlns:mv="urn:schemas-microsoft-com:mac:vml" xmlns:o="urn:schemas-microsoft-com:office:office" xmlns:r="http://schemas.openxmlformats.org/officeDocument/2006/relationships" xmlns:v="urn:schemas-microsoft-com:vml" xmlns:w10="urn:schemas-microsoft-com:office:word" xmlns:w14="http://schemas.microsoft.com/office/word/2010/wordml" xmlns:w="http://schemas.openxmlformats.org/wordprocessingml/2006/main" xmlns:wne="http://schemas.microsoft.com/office/word/2006/wordml" xmlns:wp14="http://schemas.microsoft.com/office/word/2010/wordprocessingDrawing" xmlns:wp="http://schemas.openxmlformats.org/drawingml/2006/wordprocessingDrawing" xmlns:wpc="http://schemas.microsoft.com/office/word/2010/wordprocessingCanvas" xmlns:wpg="http://schemas.microsoft.com/office/word/2010/wordprocessingGroup" xmlns:wpi="http://schemas.microsoft.com/office/word/2010/wordprocessingInk" xmlns:wps="http://schemas.microsoft.com/office/word/2010/wordprocessingShape" mc:Ignorable="w14 wp14">
+  <w:p>
+    <w:pPr>
+      <w:pStyle w:val="Header"/>
+      <w:spacing w:line="240" w:lineRule="auto" w:before="0" w:after="0"/>
+      <w:ind w:firstLine="709"/>
+      <w:jc w:val="both"/>
+    </w:pPr>
+  </w:p>
+</w:hdr>
 </file>
 
 <file path=word/numbering.xml><?xml version="1.0" encoding="utf-8"?>
@@ -705,19 +913,32 @@
   <w:style w:type="paragraph" w:default="1" w:styleId="a">
     <w:name w:val="Normal"/>
     <w:qFormat/>
+    <w:pPr>
+      <w:spacing w:line="240" w:lineRule="auto" w:before="0" w:after="0"/>
+      <w:ind w:firstLine="709"/>
+      <w:jc w:val="both"/>
+    </w:pPr>
+    <w:rPr>
+      <w:rFonts w:ascii="Times New Roman" w:hAnsi="Times New Roman"/>
+      <w:b w:val="0"/>
+      <w:sz w:val="28"/>
+    </w:rPr>
   </w:style>
   <w:style w:type="paragraph" w:styleId="1">
     <w:name w:val="heading 1"/>
     <w:qFormat/>
     <w:pPr>
+      <w:spacing w:line="240" w:lineRule="auto" w:before="0" w:after="0"/>
+      <w:ind w:firstLine="709"/>
+      <w:jc w:val="both"/>
       <w:outlineLvl w:val="0"/>
     </w:pPr>
     <w:rPr>
-      <w:rFonts w:ascii="Arial" w:hAnsi="Arial"/>
+      <w:rFonts w:ascii="Times New Roman" w:hAnsi="Times New Roman"/>
       <w:b/>
       <w:bCs/>
       <w:color w:val="000000"/>
-      <w:sz w:val="32"/>
+      <w:sz w:val="28"/>
       <w:szCs w:val="32"/>
     </w:rPr>
   </w:style>
@@ -725,24 +946,33 @@
     <w:name w:val="heading 2"/>
     <w:qFormat/>
     <w:pPr>
+      <w:spacing w:line="240" w:lineRule="auto" w:before="0" w:after="0"/>
+      <w:ind w:firstLine="709"/>
+      <w:jc w:val="both"/>
       <w:outlineLvl w:val="1"/>
     </w:pPr>
     <w:rPr>
-      <w:rFonts w:ascii="Arial" w:hAnsi="Arial"/>
+      <w:rFonts w:ascii="Times New Roman" w:hAnsi="Times New Roman"/>
       <w:b/>
       <w:bCs/>
       <w:color w:val="000000"/>
+      <w:sz w:val="28"/>
     </w:rPr>
   </w:style>
   <w:style w:type="paragraph" w:styleId="3">
     <w:name w:val="heading 3"/>
     <w:qFormat/>
     <w:pPr>
+      <w:spacing w:line="240" w:lineRule="auto" w:before="0" w:after="0"/>
+      <w:ind w:firstLine="709"/>
+      <w:jc w:val="both"/>
       <w:outlineLvl w:val="2"/>
     </w:pPr>
     <w:rPr>
+      <w:rFonts w:ascii="Times New Roman" w:hAnsi="Times New Roman"/>
+      <w:b/>
       <w:color w:val="1F4D78"/>
-      <w:sz w:val="24"/>
+      <w:sz w:val="28"/>
       <w:szCs w:val="24"/>
     </w:rPr>
   </w:style>
@@ -750,32 +980,50 @@
     <w:name w:val="heading 4"/>
     <w:qFormat/>
     <w:pPr>
+      <w:spacing w:line="240" w:lineRule="auto" w:before="0" w:after="0"/>
+      <w:ind w:firstLine="709"/>
+      <w:jc w:val="both"/>
       <w:outlineLvl w:val="3"/>
     </w:pPr>
     <w:rPr>
+      <w:rFonts w:ascii="Times New Roman" w:hAnsi="Times New Roman"/>
+      <w:b/>
       <w:i/>
       <w:iCs/>
       <w:color w:val="2E74B5"/>
+      <w:sz w:val="28"/>
     </w:rPr>
   </w:style>
   <w:style w:type="paragraph" w:styleId="5">
     <w:name w:val="heading 5"/>
     <w:qFormat/>
     <w:pPr>
+      <w:spacing w:line="240" w:lineRule="auto" w:before="0" w:after="0"/>
+      <w:ind w:firstLine="709"/>
+      <w:jc w:val="both"/>
       <w:outlineLvl w:val="4"/>
     </w:pPr>
     <w:rPr>
+      <w:rFonts w:ascii="Times New Roman" w:hAnsi="Times New Roman"/>
+      <w:b/>
       <w:color w:val="2E74B5"/>
+      <w:sz w:val="28"/>
     </w:rPr>
   </w:style>
   <w:style w:type="paragraph" w:styleId="6">
     <w:name w:val="heading 6"/>
     <w:qFormat/>
     <w:pPr>
+      <w:spacing w:line="240" w:lineRule="auto" w:before="0" w:after="0"/>
+      <w:ind w:firstLine="709"/>
+      <w:jc w:val="both"/>
       <w:outlineLvl w:val="5"/>
     </w:pPr>
     <w:rPr>
+      <w:rFonts w:ascii="Times New Roman" w:hAnsi="Times New Roman"/>
+      <w:b/>
       <w:color w:val="1F4D78"/>
+      <w:sz w:val="28"/>
     </w:rPr>
   </w:style>
   <w:style w:type="character" w:default="1" w:styleId="a0">
@@ -808,24 +1056,47 @@
   <w:style w:type="paragraph" w:styleId="a3">
     <w:name w:val="Title"/>
     <w:qFormat/>
-    <w:rPr>
-      <w:rFonts w:ascii="Arial" w:hAnsi="Arial"/>
+    <w:pPr>
+      <w:spacing w:line="240" w:lineRule="auto" w:before="0" w:after="0"/>
+      <w:ind w:firstLine="709"/>
+      <w:jc w:val="both"/>
+    </w:pPr>
+    <w:rPr>
+      <w:rFonts w:ascii="Times New Roman" w:hAnsi="Times New Roman"/>
+      <w:b/>
       <w:color w:val="000000"/>
-      <w:sz w:val="36"/>
+      <w:sz w:val="28"/>
       <w:szCs w:val="56"/>
     </w:rPr>
   </w:style>
   <w:style w:type="paragraph" w:customStyle="1" w:styleId="10">
     <w:name w:val="Строгий1"/>
     <w:qFormat/>
-    <w:rPr>
-      <w:b/>
+    <w:pPr>
+      <w:spacing w:line="240" w:lineRule="auto" w:before="0" w:after="0"/>
+      <w:ind w:firstLine="709"/>
+      <w:jc w:val="both"/>
+    </w:pPr>
+    <w:rPr>
+      <w:rFonts w:ascii="Times New Roman" w:hAnsi="Times New Roman"/>
+      <w:b w:val="0"/>
       <w:bCs/>
+      <w:sz w:val="28"/>
     </w:rPr>
   </w:style>
   <w:style w:type="paragraph" w:styleId="a4">
     <w:name w:val="List Paragraph"/>
     <w:qFormat/>
+    <w:pPr>
+      <w:spacing w:line="240" w:lineRule="auto" w:before="0" w:after="0"/>
+      <w:ind w:firstLine="709"/>
+      <w:jc w:val="both"/>
+    </w:pPr>
+    <w:rPr>
+      <w:rFonts w:ascii="Times New Roman" w:hAnsi="Times New Roman"/>
+      <w:b w:val="0"/>
+      <w:sz w:val="28"/>
+    </w:rPr>
   </w:style>
   <w:style w:type="character" w:styleId="a5">
     <w:name w:val="Hyperlink"/>
@@ -851,8 +1122,15 @@
     <w:uiPriority w:val="99"/>
     <w:semiHidden/>
     <w:unhideWhenUsed/>
-    <w:rPr>
-      <w:sz w:val="20"/>
+    <w:pPr>
+      <w:spacing w:line="240" w:lineRule="auto" w:before="0" w:after="0"/>
+      <w:ind w:firstLine="709"/>
+      <w:jc w:val="both"/>
+    </w:pPr>
+    <w:rPr>
+      <w:rFonts w:ascii="Times New Roman" w:hAnsi="Times New Roman"/>
+      <w:b w:val="0"/>
+      <w:sz w:val="28"/>
       <w:szCs w:val="20"/>
     </w:rPr>
   </w:style>
@@ -882,8 +1160,15 @@
     <w:uiPriority w:val="99"/>
     <w:semiHidden/>
     <w:unhideWhenUsed/>
-    <w:rPr>
-      <w:sz w:val="20"/>
+    <w:pPr>
+      <w:spacing w:line="240" w:lineRule="auto" w:before="0" w:after="0"/>
+      <w:ind w:firstLine="709"/>
+      <w:jc w:val="both"/>
+    </w:pPr>
+    <w:rPr>
+      <w:rFonts w:ascii="Times New Roman" w:hAnsi="Times New Roman"/>
+      <w:b w:val="0"/>
+      <w:sz w:val="28"/>
       <w:szCs w:val="20"/>
     </w:rPr>
   </w:style>

</xml_diff>